<commit_message>
Auto commit (2026-10-12 13:58) — 10 changes
Claude Code 세션 종료 시 자동 커밋.

Co-Authored-By: Claude <noreply@anthropic.com>
</commit_message>
<xml_diff>
--- a/projects/리메이크 러프 기획안 8종_v1.docx
+++ b/projects/리메이크 러프 기획안 8종_v1.docx
@@ -466,7 +466,7 @@
           <w:b w:val="0"/>
           <w:sz w:val="21"/>
         </w:rPr>
-        <w:t>치료비 대신 받은 용 알껍데기에 손을 베여 말 못 하는 아기의 말이 들리게 된 인간 치유사가, 손대면 손목이 잘리는 아기 용 왕자의 유모 시험에 뛰어들어, 부모를 죽인 범인을 본 유일한 목격자인 그 아기를 지키다 범인으로 몰리고, 끝내 아기의 말로 삼촌의 죄를 밝혀 얼음 용의 왕의 왕비가 되는 이야기.</w:t>
+        <w:t>깨진 용 알껍데기에 손을 베여 말 못 하는 아기의 말이 들리게 된 인간 치유사가, 인간 손이 닿으면 그 손목을 자르는 아기 용 왕자의 유모 시험에 뛰어들어, 부모를 죽인 범인을 본 유일한 목격자인 그 아기를 지키다 범인으로 몰리고, 끝내 아기의 말로 삼촌의 죄를 밝혀 얼음 용의 왕의 왕비가 되는 이야기.</w:t>
       </w:r>
     </w:p>
     <w:p>
@@ -573,7 +573,7 @@
           <w:b w:val="0"/>
           <w:sz w:val="21"/>
         </w:rPr>
-        <w:t>치료비 대신 받은 깨진 용 알껍데기에 손바닥을 베인 뒤로, 세 살이 안 된 아기의 속마음이 들리게 된 인간 치유사 케이티 레인. 밀린 방세 은화 마흔 닢을 벌러 케이티가 찾아간 얼음 용 왕궁에서는, 얼음 용의 왕 헨리의 아홉 달 된 막내 동생 올리가 석 달 전 폭풍 밤에 부모를 잃고 울기만 해서 유모 시험이 열린다. 하지만 왕과 왕비는 폭풍에 떨어진 게 아니다. 그 밤 헨리의 삼촌 고든 공작이 왕비가 날기 전에 마신 따뜻한 술에 가루를 탔고, 그걸 본 건 왕비 품에 안겨 있던 올리뿐이다.</w:t>
+        <w:t>치료비 대신 받은 깨진 용 알껍데기에 손바닥을 베인 뒤로, 세 살이 안 된 아기의 속마음이 들리게 된 인간 치유사 케이티 레인. 밀린 방세 은화 마흔 닢을 벌러 케이티가 찾아간 얼음 용 왕궁에서는, 얼음 용의 왕 헨리의 아홉 달 된 막내 동생 올리가 석 달 전 폭풍 밤에 부모를 잃고 울기만 해서 유모 시험이 열린다. 하지만 왕과 왕비가 하늘에서 떨어진 건 폭풍 때문이 아니다. 그 밤 헨리의 삼촌 고든 공작이 왕비가 날기 전에 마신 따뜻한 술에 가루를 탔고, 그걸 본 건 왕비 품에 안겨 있던 올리뿐이다.</w:t>
       </w:r>
     </w:p>
     <w:p>
@@ -1370,7 +1370,7 @@
           <w:b w:val="0"/>
           <w:sz w:val="21"/>
         </w:rPr>
-        <w:t>서른여섯 시간 근무 끝에 쓰러져 엘프 왕궁에 떨어진 인간 간호사가, 아기 속마음이 들리는 귀를 얻어, 손만 닿아도 사형인 보모 시험에서 저주로 아기가 된 엘프 왕을 몇 번이고 살려 내고, 끝내 그 저주를 풀어 엘프 왕의 왕비가 되는 이야기.</w:t>
+        <w:t>서른여섯 시간 근무 끝에 쓰러져 엘프 왕궁에 떨어진 인간 간호사가, 아기 속마음이 들리는 귀를 얻어, 인간 손이 닿기만 해도 사형인 보모 시험에서 저주로 아기가 된 엘프 왕을 몇 번이고 살려 내고, 끝내 그 저주를 풀어 엘프 왕의 왕비가 되는 이야기.</w:t>
       </w:r>
     </w:p>
     <w:p>
@@ -1410,7 +1410,7 @@
           <w:b w:val="0"/>
           <w:sz w:val="21"/>
         </w:rPr>
-        <w:t>2. 기저귀·트림·자장가를 당하며 속으로 호통치는 왕과 값부터 부르는 인간 보모의 서열 역전 만담</w:t>
+        <w:t>2. 기저귀·트림·자장가를 당하며 속으로 호통치는 왕과 값부터 부르는 인간 보모의 서열 역전 말싸움</w:t>
       </w:r>
     </w:p>
     <w:p>
@@ -1530,7 +1530,7 @@
           <w:b w:val="0"/>
           <w:sz w:val="21"/>
         </w:rPr>
-        <w:t>대비는 아그네스를 꾸짖으면서도, 해 지기 전 아기가 젖병을 비우면 보물 두 손 가득, 못 비우면 에밀리를 가시 우물에 던지겠다고 건다. 에밀리가 사형당할 뻔한 값부터 달라고 손을 내밀자, 아기 속 목소리가 돈만 아는 인간이라며 혀를 찬다. 에밀리가 아기에게 받아친다. 「돈만 아는 인간 아니었으면 그쪽 발가락 벌써 떨어졌어요.」 아기가 굳는다. 제 속말이 들리는 줄 처음 안 것이다. 젖병을 밀어내는 아기 속에서, 저 노파가 열흘째 입을 막아 배에 바람이 찼다는 목소리가 들린다. 에밀리가 아그네스를 돌아본다. 「이 애, 열흘 동안 트림은 시켜 봤어요?」</w:t>
+        <w:t>대비는 아그네스를 꾸짖으면서도, 해 지기 전 아기가 젖병을 비우면 보물 두 손 가득, 못 비우면 에밀리를 가시 우물에 던지겠다고 건다. 에밀리가 사형당할 뻔한 값부터 달라고 손을 내밀자, 아기 속 목소리가 돈만 아는 인간이라며 혀를 찬다. 에밀리가 아기에게 받아친다. 「돈만 아는 인간 아니었으면 그쪽 발가락 벌써 떨어졌어요.」 아기가 굳는다. 제 속말이 들리는 줄 처음 안 것이다. 젖병을 밀어내는 아기 속에서, 저 노파가 트림이 나올 때마다 열흘째 입을 막아 배에 바람이 찼다는 목소리가 들린다. 에밀리가 아그네스를 돌아본다. 「이 애, 열흘 동안 트림은 시켜 봤어요?」</w:t>
       </w:r>
     </w:p>
     <w:p>
@@ -1557,7 +1557,7 @@
           <w:b w:val="0"/>
           <w:sz w:val="21"/>
         </w:rPr>
-        <w:t>대신들이 엘프 왕족은 트림 같은 천한 소리를 안 낸다며 얼굴을 붉히고, 아기 속에서도 왕은 그런 소리 안 낸다는 호통이 터진다. 북처럼 부푼 배를 만진 에밀리가 둘 다에게 받아친다. 「체면이 배앓이 고쳐 주면 저 지금 그만둘게요.」 에밀리가 아기를 어깨에 세워 등을 두드리자 겁먹은 주먹에서 가시가 터져 어깨에 박히지만, 에밀리는 놓지 않는다. 오백 년 동안 아기 소리 한 번 없던 엘프 대전에 트림이 크게 울리고, 아기 속 목소리가 방금 그건 자기가 아니라고 우기는 사이 젖병이 빈다. 에밀리는 보물 두 손 가득에 어깨 구멍값을 따로 얹어 받는다.</w:t>
+        <w:t>대신들이 엘프 왕족은 트림 같은 천한 소리를 안 낸다며 얼굴을 붉히고, 아기 속에서도 왕은 그런 소리 안 낸다는 호통이 터진다. 북처럼 부푼 배를 만진 에밀리가 둘 다에게 받아친다. 「트림 한 번 하는 게 배 터져 죽는 것보다 덜 창피해요.」 에밀리가 아기를 어깨에 세워 등을 두드리자 겁먹은 주먹에서 가시가 터져 어깨에 박히지만, 에밀리는 놓지 않는다. 오백 년 동안 아기 소리 한 번 없던 엘프 대전에 트림이 크게 울리고, 아기 속 목소리가 방금 그건 자기가 아니라고 우기는 사이 젖병이 빈다. 에밀리는 보물 두 손 가득에 어깨 구멍값을 따로 얹어 받는다.</w:t>
       </w:r>
     </w:p>
     <w:p>
@@ -1677,7 +1677,7 @@
           <w:b w:val="0"/>
           <w:sz w:val="21"/>
         </w:rPr>
-        <w:t>에드거는 인간을 가시 우물에 던지라고 외치고, 치유사도 심장 소리가 없다며 고개를 젓는다. 끌려가던 에밀리 귀에 작아진 목소리가 들린다. 도토리가 목에 걸려 숨이 안 내려간다는 에이드리언의 목소리다. 에밀리가 아기는 살아 있고 그 목소리는 자기만 듣는다고 외치자, 대비는 실패하면 산 채로 묻겠다며 아기를 내준다.</w:t>
+        <w:t>에드거는 인간을 가시 우물에 던지라고 외치고, 치유사도 심장 소리가 없다며 고개를 젓는다. 끌려가던 에밀리 귀에 작아진 목소리가 들린다. 도토리가 목에 걸려 숨이 안 내려간다는 에이드리언의 목소리다. 에밀리가 아기는 살아 있고 그 목소리는 자기만 듣는다고 외치자, 대비는 실패하면 에밀리를 산 채로 묻겠다며 아기를 내준다.</w:t>
       </w:r>
     </w:p>
     <w:p>
@@ -2314,7 +2314,7 @@
           <w:b w:val="0"/>
           <w:sz w:val="21"/>
         </w:rPr>
-        <w:t>친오빠들에게 팔려 간 첫날밤 달아나 얼굴 모를 남자와 하룻밤을 보낸 막내가, 그 밤에 생긴 쌍둥이 중 딸을 오빠들이 몰래 궁에 팔아넘긴 줄도 모른 채, 남은 아들을 살려 준 왕세자와 가짜 가족 계약을 맺고 궁에 들어가, 끝내 두 아이를 모두 되찾고 그 밤의 남자였던 왕세자와 진짜 가족이 되는 이야기.</w:t>
+        <w:t>친오빠들에게 팔려 간 첫날밤 달아나 얼굴 모를 남자와 하룻밤을 보낸 막내가, 쌍둥이 중 딸을 오빠들이 몰래 궁에 팔아넘긴 줄도 모른 채, 피가 안 멈추는 아들을 살려 준 왕세자와 가짜 가족 계약을 맺고 궁에 들어가, 끝내 두 아이를 모두 되찾고 그 밤의 남자였던 왕세자와 진짜 가족이 되는 이야기.</w:t>
       </w:r>
     </w:p>
     <w:p>
@@ -2461,7 +2461,7 @@
           <w:b w:val="0"/>
           <w:sz w:val="21"/>
         </w:rPr>
-        <w:t>날이 밝기 전 남자는 로즈의 베일을 팔에 감은 채 사라지고, 로즈 손에는 그 밤 움켜쥔 외투에서 뜯겨 나온 은단추 하나만 남는다. 오빠들은 로즈를 다시 집으로 끌고 가, 배가 불러 오자 팔 데도 없다며 헛간에 가둔다. 아홉 달 뒤 헛간에서 혼자 쌍둥이 남매를 낳은 로즈가 정신을 잃자, 칼은 딸을 빨래 바구니째 들고 궁 뒷문으로 가 그레고리 왕자의 아내 헬렌이 보낸 시녀에게 금화 주머니를 받는다. 막 아기를 잃은 헬렌이 남편 몰래 구하던 갓난 딸이다. 깨어난 로즈는 딸이 태어나자마자 죽어 묻었다는 웨이드의 말에 주저앉고, 남은 아들을 안고 그 밤 강을 건너 달아난다.</w:t>
+        <w:t>날이 밝기 전 남자는 로즈의 베일을 팔에 감은 채 사라지고, 로즈 손에는 그 밤 움켜쥔 외투에서 뜯겨 나온 은단추 하나만 남는다. 오빠들은 로즈를 다시 집으로 끌고 가, 배가 불러 오자 팔 데도 없다며 헛간에 가둔다. 아홉 달 뒤 헛간에서 혼자 쌍둥이 남매를 낳은 로즈가 정신을 잃자, 칼은 딸을 빨래 바구니째 들고 궁 뒷문으로 가 그레고리 왕자의 아내 헬렌이 보낸 시녀에게 금화 주머니를 받는다. 막 아기를 잃은 헬렌이 남편 몰래 구하던 갓난 딸이다. 깨어난 로즈는 딸이 태어나자마자 죽어 묻었다는 웨이드의 말에 주저앉고, 남은 아들을 안고 그날 밤 강을 건너 달아난다.</w:t>
       </w:r>
     </w:p>
     <w:p>
@@ -2474,7 +2474,7 @@
           <w:b w:val="0"/>
           <w:sz w:val="21"/>
         </w:rPr>
-        <w:t>6년 뒤, 강 건너 도시에서 부잣집 빨래를 하는 로즈는 무릎만 까져도 피가 멈추지 않는 다섯 살 아들 찰리의 약값을 모은다. 찰리는 목에 건 은단추를 내밀며 성문 앞 나그네마다 이 단추 주인을 아느냐고 묻는다. 그 주인이 왕세자 줄리언이라는 것도, 쌍둥이 누나가 궁에서 공주로 자란다는 것도 로즈와 찰리는 모른다. 그날 강가 빨래터에, 그 밤의 금화도 바구니 값도 닭싸움 판에서 날린 오빠 셋이 나타난다. 웨이드가 로즈의 앞치마에서 약값 주머니를 뜯어 가도 빚이 모자라자, 칼은 조카딸에 이어 찰리까지 굴뚝 청소꾼에게 팔기로 한다. 릭이 자갈밭에 무릎이 찢긴 찰리를 수레에 던져 올리려는 순간, 누군가 말에서 뛰어내려 릭의 손목을 붙잡는다.</w:t>
+        <w:t>6년 뒤, 강 건너 도시에서 부잣집 빨래를 하는 로즈는 무릎만 까져도 피가 멈추지 않는 다섯 살 아들 찰리의 약값을 모은다. 찰리는 목에 건 은단추를 내밀며 성문 앞 나그네마다 이 단추 주인을 아느냐고 묻는다. 그 주인이 왕세자 줄리언이라는 것도, 쌍둥이 누나가 궁에서 공주로 자란다는 것도 로즈와 찰리는 모른다. 그날 강가 빨래터에 오빠 셋이 나타난다. 6년 전 오두막 남자가 던진 금화도, 딸을 판 바구니 값도 닭싸움 판에서 다 날린 뒤다. 웨이드가 로즈의 앞치마에서 약값 주머니를 뜯어 가도 빚이 모자라자, 칼은 조카딸에 이어 찰리까지 굴뚝 청소꾼에게 팔기로 한다. 릭이 자갈밭에 무릎이 찢긴 찰리를 수레에 던져 올리려는 순간, 누군가 말에서 뛰어내려 릭의 손목을 붙잡는다.</w:t>
       </w:r>
     </w:p>
     <w:p>
@@ -2754,7 +2754,7 @@
           <w:b w:val="0"/>
           <w:sz w:val="21"/>
         </w:rPr>
-        <w:t>근위병이 찰리를 은검 앞으로 끌고 가자, 찰리는 목에 건 뿔피리를 힘껏 분다. 길을 잃으면 할아버지가 찾으러 와 줄 거라던 그 뿔피리 소리에도 국왕은 고개를 돌린다. 칼날에 베이면 찰리의 피가 멈추지 않는다는 걸 아는 줄리언이 무릎을 꿇는다. 「찰리는 제 아들이 아닙니다.」 찰리가 진짜 자기 아들인 줄 모르고 한 자백이다. 국왕은 이제 줄리언의 말은 못 믿겠다며 은검에 맡기라 하고, 근위병이 찰리의 작은 손을 펴서 칼날 위로 끌어간다. 카메라가 그 손바닥을 바짝 잡은 채 날이 살에 닿는 순간, 로즈가 소리친다. 「그 애는 피가 안 멈춰요!」</w:t>
+        <w:t>근위병이 찰리를 은검 앞으로 끌고 가자, 찰리는 목에 건 뿔피리를 힘껏 분다. 길을 잃으면 할아버지가 찾으러 와 줄 거라던 그 뿔피리 소리에도 국왕은 고개를 돌린다. 칼날에 베이면 찰리의 피가 멈추지 않는다는 걸 아는 줄리언이 무릎을 꿇는다. 「찰리는 제 아들이 아닙니다.」 줄리언은 찰리가 진짜 자기 아들인 줄 모르고 자백한 것이다. 국왕은 이제 줄리언의 말은 못 믿겠다며 은검에 맡기라 하고, 근위병이 찰리의 작은 손을 펴서 칼날 위로 끌어간다. 카메라가 그 손바닥을 바짝 잡은 채 날이 살에 닿는 순간, 로즈가 소리친다. 「그 애는 피가 안 멈춰요!」</w:t>
       </w:r>
     </w:p>
     <w:p>
@@ -3512,7 +3512,7 @@
           <w:b w:val="0"/>
           <w:sz w:val="21"/>
         </w:rPr>
-        <w:t>날이 밝기 전 남자는 마차와 함께 사라지고, 엘라 손에는 늑대 머리가 새겨진 검은 반지 하나만 남는다. 6년 뒤 항구 어시장, 생선 배를 가르는 엘라는 개리와 렉스가 냄새로 자기를 찾지 못하게 6년째 냄새를 지우는 쓴 약초를 마신다. 다섯 살 딸 릴리는 보름달마다 열이 끓어 숨이 넘어가는, 세바스찬과 똑같은 열병을 앓는다. 릴리는 밤마다 반지에 코를 대고 아빠 냄새가 난다며, 시장에 오는 남자마다 바짓단에 코를 대고 아빠를 찾는다. 손님 생선 비늘을 긁어 주고 한 닢씩 받은 동전은, 아빠를 찾으면 시킬 일을 엄마에게 글자를 물어 가며 적은 종이와 함께 조개 저금통에 모은다. 반지 주인이 왕세자 세바스찬이라는 건 엘라도 릴리도 모른다.</w:t>
+        <w:t>날이 밝기 전 남자는 마차와 함께 사라지고, 엘라 손에는 늑대 머리가 새겨진 검은 반지 하나만 남는다. 6년 뒤 항구 어시장, 생선 배를 가르는 엘라는 개리와 렉스가 냄새로 자기를 찾지 못하게 6년째 냄새를 지우는 쓴 약초를 마신다. 다섯 살 딸 릴리는 보름달마다 열이 끓어 숨이 넘어가는, 세바스찬과 똑같은 열병을 앓는다. 릴리는 밤마다 반지에 코를 대고 아빠 냄새가 난다며, 시장에 오는 남자마다 바짓단에 코를 대고 아빠를 찾는다. 릴리가 손님 생선 비늘을 긁어 주고 한 닢씩 받은 동전은, 아빠를 찾으면 시킬 일을 엄마에게 글자를 물어 가며 적은 종이와 함께 조개 저금통에 모은다. 반지 주인이 왕세자 세바스찬이라는 건 엘라도 릴리도 모른다.</w:t>
       </w:r>
     </w:p>
     <w:p>
@@ -3565,7 +3565,7 @@
           <w:b w:val="0"/>
           <w:sz w:val="21"/>
         </w:rPr>
-        <w:t>개리와 렉스가 달아나는 사이, 세바스찬은 6년째 찾던 그 밤 마차 안의 달콤한 냄새를 잠깐 맡고 엘라를 돌아보지만, 바닷바람이 불자 냄새는 다시 나지 않는다. 두 사람 다 서로가 그 밤의 상대인 줄 모른다. 그때 호위가 다가와, 다음 보름달 연회까지 짝과 아이를 국왕 앞에 데려가지 못하면 왕세자 자리가 형에게 넘어간다고 귀띔한다. 그 말을 엿들은 릴리는 조개 저금통을 깨뜨려 동전 열두 닢과 '아빠 일' 종이를 세바스찬 손에 올린다. 엄마 옆에서 자기, 엄마 손 잡고 연회 들어가기, 내 머리 땋기, 나랑 같이 밥 먹기, 엄마 괴롭힌 아저씨 혼내 주기. 일 하나에 한 닢, 그만두면 벌금 백 닢이라는 릴리 말에 웃음을 터뜨린 세바스찬은, 방금 한 마지막 일 값이라는 첫 닢을 집는다. 친딸이 생선 비늘을 긁어 번 동전에 자기가 고용됐다는 걸 세바스찬은 모른다. 「좋아, 고용됐다. 다음 보름달까지 나는 이 아이 아빠고, 당신은 내 짝이야.」</w:t>
+        <w:t>개리와 렉스가 달아나는 사이, 세바스찬은 6년째 찾던 그 밤 마차 안의 달콤한 냄새를 잠깐 맡고 엘라를 돌아보지만, 바닷바람이 불자 냄새는 다시 나지 않는다. 두 사람 다 서로가 그 밤의 상대인 줄 모른다. 그때 호위가 다가와, 다음 보름달 연회까지 짝과 아이를 국왕 앞에 데려가지 못하면 왕세자 자리가 형에게 넘어간다고 귀띔한다. 그 말을 엿들은 릴리는 조개 저금통을 깨뜨려 동전 열두 닢과 '아빠 일' 종이를 세바스찬 손에 올린다. 엄마 옆에서 자기, 엄마 손 잡고 연회 들어가기, 내 머리 땋기, 나랑 같이 밥 먹기, 엄마 괴롭힌 아저씨 혼내 주기. 일 하나에 한 닢, 그만두면 벌금 백 닢이라는 릴리 말에 웃음을 터뜨린 세바스찬은, 방금 엄마 괴롭힌 아저씨들을 혼내 줬으니 그 값이라며 릴리가 내민 첫 닢을 집는다. 친딸이 생선 비늘을 긁어 번 동전에 자기가 고용됐다는 걸 세바스찬은 모른다. 「좋아, 고용됐다. 다음 보름달까지 나는 이 아이 아빠고, 당신은 내 짝이야.」</w:t>
       </w:r>
     </w:p>
     <w:p>
@@ -3645,7 +3645,7 @@
           <w:b w:val="0"/>
           <w:sz w:val="21"/>
         </w:rPr>
-        <w:t>그날 밤 릴리는 목록 첫 줄 '엄마 옆에서 자기'는 어려운 일이라 두 닢이라며 세바스찬 손에 동전 두 닢을 쥐여 주고, 엘라와 세바스찬을 한 침대에 눕힌 뒤 그 가운데로 파고든다. 세바스찬이 릴리의 진짜 아빠는 어디 있느냐고 묻자, 엘라는 6년째 안 돌아오는 떠돌이 사냥꾼이라고 지어낸다. 세바스찬은 그놈을 찾으면 다리부터 분질러 놓겠다고 이를 간다. 그놈이 자기라는 걸 세바스찬은 모른다. 잠든 줄 알았던 릴리가 눈을 감은 채 중얼거린다. 「그 아저씨 찾으면, 나도 한 번만 물어도 돼요?」</w:t>
+        <w:t>그날 밤 릴리는 목록 첫 줄 '엄마 옆에서 자기'는 어려운 일이라 두 닢이라며 세바스찬 손에 동전 두 닢을 쥐여 주고, 엘라와 세바스찬을 한 침대에 눕힌 뒤 그 가운데로 파고든다. 세바스찬이 릴리의 진짜 아빠는 어디 있느냐고 묻자, 엘라는 6년째 안 돌아오는 떠돌이 사냥꾼이라고 지어낸다. 세바스찬은 그놈을 찾으면 다리부터 분질러 놓겠다고 이를 간다. 그놈이 자기라는 걸 세바스찬은 모른다. 잠든 줄 알았던 릴리가 눈을 감은 채 중얼거린다. 「그 아저씨 찾으면, 나도 한 번만 깨물어도 돼요?」</w:t>
       </w:r>
     </w:p>
     <w:p>
@@ -3805,7 +3805,7 @@
           <w:b w:val="0"/>
           <w:sz w:val="21"/>
         </w:rPr>
-        <w:t>달의 무녀가 보랏빛 불꽃을 국왕 앞으로 옮기자, 빅터가 먼저 소피의 손을 불에 넣어 멀쩡한 걸 보인다. 릴리가 저 불에 손을 넣으면 뼈까지 탈 거라 믿는 세바스찬은 국왕 앞에 무릎을 꿇는다. 「릴리는 제 딸이 아닙니다. 저 아이를 불에 넣지 마십시오.」 릴리가 자기 친딸이라는 걸 세바스찬은 모른다. 그러자 릴리가 근위병 다리 사이로 빠져나와 세바스찬 가슴 주머니의 동전 열두 닢을 국왕 발 앞에 쏟고, 아빠는 자기가 동전 주고 고용한 거니까 아빠 잘못이 아니라며 자기를 혼내라고 국왕 앞을 막아선다. 국왕은 동전 열두 닢에 왕세자 자리를 걸고 자기를 속인 대가를 똑똑히 보겠다며, 근위병들에게 엘라를 붙잡고 릴리의 손을 불꽃 위로 끌어가라고 한다. 엘라가 비명을 지르는 순간, 약초 기운이 다 빠진 엘라 몸에서 보름달 밤 마차 안의 그 달콤한 냄새가 터져 나온다. 근위병을 막아서던 세바스찬이 그 자리에 굳어 엘라를 돌아보는 사이, 릴리의 작은 손이 보랏빛 불꽃에 닿는다. 카메라는 불꽃 속 릴리의 손끝에서 멈춘다.</w:t>
+        <w:t>달의 무녀가 보랏빛 불꽃을 국왕 앞으로 옮기자, 빅터가 먼저 소피의 손을 불에 넣어 멀쩡한 걸 보인다. 릴리가 저 불에 손을 넣으면 뼈까지 탈 거라 믿는 세바스찬은 국왕 앞에 무릎을 꿇는다. 「릴리는 제 딸이 아닙니다. 저 아이를 불에 넣지 마십시오.」 릴리가 자기 친딸이라는 걸 세바스찬은 모른다. 그러자 릴리가 근위병 다리 사이로 빠져나와 세바스찬 가슴 주머니의 동전 열두 닢을 국왕 발 앞에 쏟고, 아빠는 자기가 동전 주고 고용한 거니까 아빠 잘못이 아니라며 자기를 혼내라고 국왕 앞을 막아선다. 국왕은 동전 열두 닢에 고용돼 자기를 속인 대가를 똑똑히 보겠다며, 근위병들에게 엘라를 붙잡고 릴리의 손을 불꽃 위로 끌어가라고 한다. 엘라가 비명을 지르는 순간, 약초 기운이 다 빠진 엘라 몸에서 보름달 밤 마차 안의 그 달콤한 냄새가 터져 나온다. 근위병을 막아서던 세바스찬이 그 자리에 굳어 엘라를 돌아보는 사이, 릴리의 작은 손이 보랏빛 불꽃에 닿는다. 카메라는 불꽃 속 릴리의 손끝에서 멈춘다.</w:t>
       </w:r>
     </w:p>
     <w:p>
@@ -4496,7 +4496,7 @@
           <w:b w:val="0"/>
           <w:sz w:val="21"/>
         </w:rPr>
-        <w:t>엘프 궁전에서 물동이를 나르며 엘프 귀족들의 발길질을 받고 사는 인간 노예 그레이스 밀러. 보름달이 뜬 밤, 그레이스는 엘프 왕 루카스의 욕실에 목욕물을 채우러 들어갔다가, 물속에서 가쁜 숨을 몰아쉬는 루카스와 눈이 마주친다. 누군가 왕의 포도주에 미약을 탄 것이다. 초록빛으로 번뜩이는 눈으로 그레이스의 턱을 움켜쥔 루카스는 그녀를 물속으로 끌어들이고, 노예 손이 왕의 몸에 닿으면 손목이 잘린다며 버티던 그레이스는 결국 그의 젖은 어깨를 붙잡는다. 「저, 남자는 처음이에요.」 루카스는 대답 대신 손끝에서 초록 덩굴을 피워 올려 그레이스의 허리를 감고, 그녀를 욕조 가장자리로 끌어올린다.</w:t>
+        <w:t>엘프 궁전에서 물동이를 나르며 엘프 귀족들의 발길질을 받고 사는 인간 노예 그레이스 밀러. 보름달이 뜬 밤, 그레이스는 엘프 왕 루카스의 욕실에 목욕물을 채우러 들어갔다가, 물속에서 가쁜 숨을 몰아쉬는 루카스와 눈이 마주친다. 누군가 왕의 포도주에 최음 미약을 탄 것이다. 초록빛으로 번뜩이는 눈으로 그레이스의 턱을 움켜쥔 루카스는 그녀를 물속으로 끌어들이고, 노예 손이 왕의 몸에 닿으면 손목이 잘린다며 버티던 그레이스는 결국 그의 젖은 어깨를 붙잡는다. 「저, 남자는 처음이에요.」 루카스는 대답 대신 손끝에서 초록 덩굴을 피워 올려 그레이스의 허리를 감고, 그녀를 욕조 가장자리로 끌어올린다.</w:t>
       </w:r>
     </w:p>
     <w:p>
@@ -4656,7 +4656,7 @@
           <w:b w:val="0"/>
           <w:sz w:val="21"/>
         </w:rPr>
-        <w:t>아흐레를 걸어 왕궁에 닿은 그레이스는, 알이 깨기까지 아흔 날이 남은 그날 궁 마당에 늘어선 하녀들 맨 끝에 선다. 엘프 하녀, 드워프 하녀, 고양이족 하녀가 차례로 알을 안지만 알은 누구 손에서도 회색이다. 마지막 차례인 인간 노예들 사이에서 두건을 깊이 쓴 그레이스가 알을 받아 가슴에 대자, 알이 금빛으로 빛나며 그녀 심장 소리에 맞춰 뛴다. 마사는 단숨에 달려와 알이 이 손에서만 웃는다며 그레이스의 손을 붙잡고, 캐롤라인은 두건 아래 얼굴을 알아보고 얼어붙는다. 단상에서 내려온 루카스가 그레이스의 두건을 벗기고, 손끝에 초록 덩굴을 피워 올린다. 「숨통을 끊겠다고 했을 텐데.」</w:t>
+        <w:t>아흐레를 걸어 왕궁에 닿은 그레이스는, 알이 깨기까지 아흔 날이 남은 그날 궁 마당에 늘어선 하녀들 맨 끝에 선다. 엘프 하녀, 드워프 하녀, 고양이족 하녀가 차례로 알을 안지만 알은 누구 손에서도 회색이다. 마지막 차례인 인간 노예들 사이에서 두건을 깊이 쓴 그레이스가 알을 받아 가슴에 대자, 알이 금빛으로 빛나며 그녀 심장 소리에 맞춰 뛴다. 마사는 단숨에 달려와 알이 이 손에서만 금빛으로 빛난다며 그레이스의 손을 붙잡고, 캐롤라인은 두건 아래 얼굴을 알아보고 얼어붙는다. 단상에서 내려온 루카스가 그레이스의 두건을 벗기고, 손끝에 초록 덩굴을 피워 올린다. 「숨통을 끊겠다고 했을 텐데.」</w:t>
       </w:r>
     </w:p>
     <w:p>
@@ -4696,7 +4696,7 @@
           <w:b w:val="0"/>
           <w:sz w:val="21"/>
         </w:rPr>
-        <w:t>그레이스는 그 말에 입을 다물고, 그날부터 낮마다 캐롤라인의 발치에 무릎 꿇고 자기 알을 품는다. 해가 지면 캐롤라인은 그레이스를 궁 밖으로 내쫓고, 회색으로 식은 알을 혼자 안는다. 마사는 금빛으로 뛰는 알을 들여다볼 때마다 네가 이 아이 엄마였으면 좋겠다고 웃으며, 궁 밖 자기 별채의 빈방을 그레이스에게 내준다. 그렇게 여든여덟 날이 지나 알이 깨기까지 이틀이 남은 저녁, 루카스는 알 방 하녀 명부를 펼쳐 놓고 그 인간이 오늘은 몇 시에 나갔느냐고 묻는다. 시종장이 그 인간 얘기는 꺼내지도 말라던 분이 누구시냐고 한숨 쉬자, 루카스는 명부를 덮고 성문으로 나간다.</w:t>
+        <w:t>그레이스는 그 말에 입을 다물고, 그날부터 낮마다 캐롤라인의 발치에 무릎 꿇고 자기 알을 품는다. 해가 지면 캐롤라인은 그레이스를 궁 밖으로 내쫓고, 회색으로 식은 알을 혼자 안는다. 마사는 금빛으로 뛰는 알을 들여다볼 때마다 네가 이 아이 엄마였으면 좋겠다고 웃으며, 궁 밖 자기 별채의 빈방을 그레이스에게 내준다. 그렇게 여든여덟 날이 지나 알이 깨기까지 이틀이 남은 저녁, 루카스는 알 방 하녀 명부를 펼쳐 놓고 그 인간이 오늘은 몇 시에 나갔느냐고 묻는다. 시종장이 그 인간 얘기는 꺼내지도 말라고 명령한 게 바로 왕이라며 한숨 쉬자, 루카스는 명부를 덮고 성문으로 나간다.</w:t>
       </w:r>
     </w:p>
     <w:p>
@@ -4709,7 +4709,7 @@
           <w:b w:val="0"/>
           <w:sz w:val="21"/>
         </w:rPr>
-        <w:t>성문 앞에서 경비병들에게 떠밀려 나가던 그레이스는 루카스와 마주친다. 그레이스가 다시는 왕의 눈에 띄지 않겠다고 고개를 숙이자, 루카스는 그 말을 꼭 지키라며 그녀 귀에 대고 낮게 덧붙인다. 「서쪽 정원 덩굴 담장 밑에 개구멍이 하나 있다. 자정 종이 칠 때 그리로 기어 들어오면 절대 안 된다.」</w:t>
+        <w:t>성문 앞에서 경비병들에게 떠밀려 나가던 그레이스는 루카스와 마주친다. 그레이스가 다시는 왕의 눈에 띄지 않겠다고 고개를 숙이자, 루카스는 그 말을 꼭 지키라면서, 오지 말라는 말로 몰래 들어올 길을 그녀 귀에 일러 준다. 「서쪽 정원 덩굴 담장 밑에 개구멍이 하나 있다. 자정 종이 칠 때 그리로 기어 들어오면 절대 안 된다.」</w:t>
       </w:r>
     </w:p>
     <w:p>
@@ -4736,7 +4736,7 @@
           <w:b w:val="0"/>
           <w:sz w:val="21"/>
         </w:rPr>
-        <w:t>그날 자정, 그레이스는 종이 치는 사이 덩굴 담장 밑 개구멍을 기어 캐롤라인 침실 옆 알 방으로 숨어든다. 회색으로 식은 알을 가슴에 안자 알이 다시 금빛으로 깜빡이고, 그 순간 어둠 속에서 길을 일러 준 루카스가 그레이스의 손목을 잡는다. 루카스는 그레이스를 벽에 밀어붙이고 그녀 손을 제 목덜미에 갖다 댄다. 캐롤라인과 보냈다는 밤은 하나도 떠오르지 않는데, 이 손이 닿은 자리만 그 밤처럼 뜨겁다는 것이다. 그레이스가 놓으라고 버둥거리자 루카스는 숨이 이렇게 가쁜데 무슨 소리냐며 더 바짝 붙어 서고, 이번엔 또 무엇을 훔치러 왔느냐고 묻는다. 그레이스는 눈물을 흘리면서도 루카스의 눈을 피하지 않는다. 「밤마다 안아 줘야 하는 남자가 따로 있어요. 당신은 아니고요.」</w:t>
+        <w:t>그날 자정, 그레이스는 종이 치는 사이 덩굴 담장 밑 개구멍을 기어 캐롤라인 침실 옆 알 방으로 숨어든다. 회색으로 식은 알을 가슴에 안자 알이 다시 금빛으로 깜빡이고, 그 순간 어둠 속에서 길을 일러 준 루카스가 그레이스의 손목을 잡는다. 루카스는 그레이스를 벽에 밀어붙이고 그녀 손을 제 목덜미에 갖다 댄다. 캐롤라인과 보냈다고 믿어 온 그 밤은 하나도 떠오르지 않는데, 그레이스의 손이 닿은 자리만 이상하게 뜨겁다는 것이다. 그레이스가 놓으라고 버둥거리자 루카스는 숨이 이렇게 가쁜데 무슨 소리냐며 더 바짝 붙어 서고, 이번엔 또 무엇을 훔치러 왔느냐고 묻는다. 그레이스는 눈물을 흘리면서도 루카스의 눈을 피하지 않는다. 「밤마다 안아 줘야 하는 남자가 따로 있어요. 당신은 아니고요.」</w:t>
       </w:r>
     </w:p>
     <w:p>
@@ -4803,7 +4803,7 @@
           <w:b w:val="0"/>
           <w:sz w:val="21"/>
         </w:rPr>
-        <w:t>다음 날 밤, 대관식 전야. 왕궁 대전에는 엘프 귀족과 모든 종족의 사신이 모이고, 단상 위에는 왕비의 관이 놓인다. 자정이 지나 백 일째가 되는 순간 알이 깨면, 그 알을 낳았다는 캐롤라인이 관을 쓴다. 그레이스는 두 손목에 사슬을 찬 채 캐롤라인 발치에 무릎 꿇고 마지막 밤의 알을 품는다. 대관식이 끝나는 대로 그레이스는 빗속 성문에서 들었던 그 말대로 루카스의 덩굴에 숨통이 끊긴다. 마사는 이 아이가 저 손에서만 웃는다며 사슬을 풀어 달라고 아들에게 매달리지만, 루카스는 그래서 더 위험한 손이라며 고개를 젓는다. 루카스는 끝까지 알 속 아이가 캐롤라인이 낳은 자기 후계자라고 믿는다.</w:t>
+        <w:t>다음 날 밤, 대관식 전야. 왕궁 대전에는 엘프 귀족과 모든 종족의 사신이 모이고, 단상 위에는 왕비의 관이 놓인다. 자정이 지나 백 일째가 되는 순간 알이 깨면, 그 알을 낳았다는 캐롤라인이 관을 쓴다. 그레이스는 두 손목에 사슬을 찬 채 캐롤라인 발치에 무릎 꿇고 마지막 밤의 알을 품는다. 대관식이 끝나는 대로 그레이스는 빗속 성문에서 들었던 그 말대로 루카스의 덩굴에 숨통이 끊긴다. 마사는 이 알이 저 손에서만 빛난다며 사슬을 풀어 달라고 아들에게 매달리지만, 루카스는 그래서 더 위험한 손이라며 고개를 젓는다. 루카스는 끝까지 알 속 아이가 캐롤라인이 낳은 자기 후계자라고 믿는다.</w:t>
       </w:r>
     </w:p>
     <w:p>
@@ -5076,7 +5076,7 @@
           <w:b w:val="0"/>
           <w:sz w:val="21"/>
         </w:rPr>
-        <w:t>· 손주를 천 년 기다린 대비가 정체를 모른 채 친손주를 아낌 → 4화 눈물의 선포, 5화 "이 손에서만 웃는다", 6화 별채 빈방</w:t>
+        <w:t>· 손주를 천 년 기다린 대비가 정체를 모른 채 친손주를 아낌 → 4화 눈물의 선포, 5화 "알이 이 손에서만 금빛으로 빛난다", 6화 별채 빈방</w:t>
       </w:r>
     </w:p>
     <w:p>
@@ -5560,7 +5560,7 @@
           <w:b w:val="0"/>
           <w:sz w:val="21"/>
         </w:rPr>
-        <w:t>인간이라는 이유로 엘프 왕궁에서 평생 바닥만 닦아 온 노예 해나 리드. 보름달이 뜬 밤, 왕의 욕실에 물을 채우러 들어간 해나 앞에서 엘프 왕 가브리엘이 붉게 달아오른 눈으로 물 밖으로 걸어 나온다. 해나는 왕이 무언가에 취했다며 물동이를 떨어뜨리고 뒷걸음질 치지만, 가브리엘은 그녀의 턱을 쥐고 눈을 피하지 말라고 명령한다. 해나가 남자는 처음이라 무섭다며 그의 젖은 가슴을 밀어내자, 가브리엘은 그 손목을 잡아 그녀를 침상에 눕힌다. 「처음이면 더 좋지. 오늘 밤 네 몸은 전부 내 것이다.」</w:t>
+        <w:t>인간이라는 이유로 엘프 왕궁에서 평생 바닥만 닦아 온 노예 해나 리드. 보름달이 뜬 밤, 왕의 욕실에 물을 채우러 들어간 해나 앞에서, 누군가 탄 약에 취해 눈이 붉게 충혈된 엘프 왕 가브리엘이 물 밖으로 걸어 나온다. 해나는 왕이 무언가에 취했다며 물동이를 떨어뜨리고 뒷걸음질 치지만, 가브리엘은 그녀의 턱을 쥐고 눈을 피하지 말라고 명령한다. 해나가 남자는 처음이라 무섭다며 그의 젖은 가슴을 밀어내자, 가브리엘은 그 손목을 잡아 그녀를 침상에 눕힌다. 「처음이면 더 좋지. 오늘 밤 네 몸은 전부 내 것이다.」</w:t>
       </w:r>
     </w:p>
     <w:p>
@@ -5760,7 +5760,7 @@
           <w:b w:val="0"/>
           <w:sz w:val="21"/>
         </w:rPr>
-        <w:t>해나는 손목을 비틀며 처음 뵙는 분이라고 고개를 돌리지만, 가브리엘은 그 밤 자기 등에 남은 손톱자국이 이 손 모양이었다며 손목을 놓지 않는다. 이번엔 또 무얼 훔치러 왔냐고 몰아붙이는 가브리엘을, 해나는 눈물이 고인 채 똑바로 올려다본다. 「내가 목숨 걸고 지키러 온 남자는 따로 있어요. 당신 말고요.」 세계수가 꽃을 피운 참가자는 왕도 떨어뜨릴 수 없어서, 가브리엘은 사람들 앞에서 그녀를 놓을 수밖에 없다. 해나가 관문 말고는 다시는 눈앞에 나타나지 않겠다고 맹세하자, 가브리엘은 그 말을 꼭 지키라며 낮게 덧붙인다. 오늘 밤부터 참가자는 성 밖으로 못 나가니, 세탁장 뒤 수로에 철창 하나가 빠져 있다는 걸 알아도 절대 그리로 드나들지 말라는 것이다.</w:t>
+        <w:t>해나는 손목을 비틀며 처음 뵙는 분이라고 고개를 돌리지만, 가브리엘은 그 밤 자기 등에 남은 손톱자국이 이 손 모양이었다며 손목을 놓지 않는다. 이번엔 또 무얼 훔치러 왔냐고 몰아붙이는 가브리엘을, 해나는 눈물이 고인 채 똑바로 올려다본다. 「내가 목숨 걸고 지키러 온 남자는 따로 있어요. 당신 말고요.」 해나가 지키러 온 남자는 보육원에 맡겨 둔 아들 핀이다. 세계수가 꽃을 피운 참가자는 왕도 떨어뜨릴 수 없어서, 가브리엘은 사람들 앞에서 그녀를 놓을 수밖에 없다. 해나가 관문 말고는 다시는 눈앞에 나타나지 않겠다고 맹세하자, 가브리엘은 그 말을 꼭 지키라며 낮게 덧붙인다. 오늘 밤부터 참가자는 성 밖으로 못 나가니, 세탁장 뒤 수로에 철창 하나가 빠져 있다는 걸 알아도 절대 그리로 드나들지 말라는 것이다.</w:t>
       </w:r>
     </w:p>
     <w:p>
@@ -5840,7 +5840,7 @@
           <w:b w:val="0"/>
           <w:sz w:val="21"/>
         </w:rPr>
-        <w:t>해나는 커튼 앞을 막아서며 보육원 아이인데 밤새 열이 나서 몰래 데려왔다고 둘러댄다. 가브리엘은 커튼 대신 젖에 젖은 해나의 가슴께를 내려다보며, 아이를 낳은 적 없는 여자 몸에서 왜 젖이 나오냐고 묻는다. 해나는 어차피 자기를 피 도둑으로 볼 거면 마음대로 생각하고 당장 나가라며 그의 가슴을 밀어내고, 가브리엘은 끝내 커튼을 걷지 못하고 방을 나간다. 가브리엘은 커튼 뒤 아기가 자기 아들이라는 걸 아직 모른다.</w:t>
+        <w:t>해나는 커튼 앞을 막아서며 보육원 아이인데 밤새 열이 나서 몰래 데려왔다고 둘러댄다. 가브리엘은 커튼 대신 젖에 젖은 해나의 가슴께를 내려다보며, 아이를 낳은 적 없는 여자 몸에서 왜 젖이 나오냐고 묻는다. 해나는 어차피 자기를 왕의 피를 훔치려던 여자로 볼 거면 마음대로 생각하고 당장 나가라며 그의 가슴을 밀어내고, 가브리엘은 끝내 커튼을 걷지 못하고 방을 나간다. 가브리엘은 커튼 뒤 아기가 자기 아들이라는 걸 아직 모른다.</w:t>
       </w:r>
     </w:p>
     <w:p>
@@ -5880,7 +5880,7 @@
           <w:b w:val="0"/>
           <w:sz w:val="21"/>
         </w:rPr>
-        <w:t>사브리나는 그 울음소리를 다음 날 밤 무도회까지 아무에게도 말하지 않는다. 고양이족 여전사의 묘목이 자정에 누렇게 져서, 무도회장 세계수 아래에는 사브리나와 브렌다, 해나만 남는다. 마지막 관문은 왕과 춤을 춘 뒤 함께 세계수 몸통에 손을 얹는 것이다. 세계수 꼭대기에 금빛 꽃이 피는 여자는 수액 한 잔을 받아 왕비가 되고, 꽃이 시들면 그대로 탈락이다. 덩굴이 가슴 바로 아래까지 오른 핀을 망토 속에 안은 해나는 차례를 기다리며 핀의 숨소리만 센다. 브렌다의 꽃봉오리가 시들고, 사브리나 앞에서 꽃봉오리가 반쯤 열리다 멈춘 뒤, 마지막으로 해나가 가브리엘과 춤을 춘다. 두 사람이 세계수에 손을 얹는 순간, 사브리나가 이 여자가 망토 속에 뭘 숨겼는지 보시라고 외치며 해나의 망토를 잡아 뜯는다.</w:t>
+        <w:t>사브리나는 그 울음소리를 다음 날 밤 무도회까지 아무에게도 말하지 않는다. 고양이족 여전사의 묘목이 자정에 누렇게 져서, 무도회장 세계수 아래에는 사브리나와 브렌다, 해나만 남는다. 마지막 관문은 왕과 춤을 춘 뒤 함께 세계수 몸통에 손을 얹는 것이다. 세계수 꼭대기에 금빛 꽃이 피는 여자는 수액 한 잔을 받아 왕비가 되고, 꽃이 시들면 그대로 탈락이다. 덩굴이 가슴 바로 아래까지 오른 핀을 망토 속에 안은 해나는 차례를 기다리며 핀의 숨소리만 센다. 브렌다의 꽃봉오리는 시들고, 사브리나의 꽃봉오리는 반쯤 열리다 멈춘 뒤, 마지막으로 해나가 가브리엘과 춤을 춘다. 두 사람이 세계수에 손을 얹는 순간, 사브리나가 이 여자가 망토 속에 뭘 숨겼는지 보시라고 외치며 해나의 망토를 잡아 뜯는다.</w:t>
       </w:r>
     </w:p>
     <w:p>
@@ -6582,7 +6582,7 @@
           <w:b w:val="0"/>
           <w:sz w:val="21"/>
         </w:rPr>
-        <w:t>3. 다시 눈이 멀까 봐 맞을 때마다 머리부터 감싸야 하는 아슬아슬한 버팀</w:t>
+        <w:t>3. 머리를 한 번만 맞아도 영영 다시 눈이 머는 일주일, 맞을 때마다 머리부터 감싸며 버티는 본처</w:t>
       </w:r>
     </w:p>
     <w:p>
@@ -6595,7 +6595,7 @@
           <w:b w:val="0"/>
           <w:sz w:val="21"/>
         </w:rPr>
-        <w:t>4. 남편이 준 안내견까지 짓밟힌 본처의 분노와 내연녀 참교육</w:t>
+        <w:t>4. 남편이 준 안내견까지 짓밟힌 본처가 내연녀에게 되갚는 참교육</w:t>
       </w:r>
     </w:p>
     <w:p>
@@ -6703,7 +6703,7 @@
           <w:b w:val="0"/>
           <w:sz w:val="21"/>
         </w:rPr>
-        <w:t>오드리가 정말 당신 남편이냐고 되묻자, 티파니는 남편 이름만 듣고 겁먹었냐며, 마크가 너 같은 장님은 보기만 해도 역겹다고 했다고 비웃는다. 타일러도 엄마 곁에 붙어, 아빠가 장님은 거울도 필요 없어서 좋겠다고 했다며 깔깔댄다. 오드리는 그제야 타일러의 얼굴을 똑바로 본다. 방금 휴대폰 화면에서 본 마크의 눈과 코가 여섯 살 아이 얼굴에 그대로 있다. 2년 전, 임신하면 위험하다는 진단을 받은 날, 마크는 오드리 손에 반지를 하나 더 끼워 주며 아이 없는 집이 조용해서 더 좋다고 했었다.</w:t>
+        <w:t>오드리가 정말 당신 남편이냐고 되묻자, 티파니는 남편 이름만 듣고 겁먹었냐며, 마크가 너 같은 장님은 보기만 해도 역겹다고 했다고 비웃는다. 타일러도 엄마 곁에 붙어, 아빠가 장님은 거울도 필요 없어서 좋겠다고 했다며 깔깔댄다. 오드리는 그제야 타일러의 얼굴을 똑바로 본다. 방금 휴대폰 화면에서 본 마크의 눈과 코가 여섯 살 아이 얼굴에 그대로 있다. 2년 전, 오드리가 임신하면 위험하다는 진단을 받은 날, 마크는 오드리 손에 반지를 하나 더 끼워 주며 아이 없는 집이 조용해서 더 좋다고 했었다.</w:t>
       </w:r>
     </w:p>
     <w:p>
@@ -6797,7 +6797,7 @@
           <w:b w:val="0"/>
           <w:sz w:val="21"/>
         </w:rPr>
-        <w:t>그 경보는 웰스 타워 회의실에 있던 닉의 화면에 뜨지만, 폭풍 속에서 몇 번 깜빡이다 끊긴다. 하늘길이 닫힐 수 있다는 비서의 말에도 닉은 당장 전용기를 띄우라고 한다. 그 시각 공항 하차장, 빗속에 베어를 안고 주저앉은 오드리 앞에 검은 SUV가 선다. 티파니가 운전기사를 데리고 쫓아 나온 것이다. 기사가 오드리의 팔을 잡아 차에 태우려 하자, 피투성이 베어가 다시 일어나 기사 앞을 막아선다. 티파니가 저 개를 치우라고 하고, 기사는 트렁크에서 꺼낸 타이어 렌치로 베어를 내리친다. 티파니는 오드리의 머리채를 잡아 그 앞으로 얼굴을 들이민다. 빗물 위에 쓰러진 베어가 더는 움직이지 않는다. 「방금 거 진짜 볼만했는데. 장님이라 아깝다.」 오드리는 다 봤다. 렌치가 몇 번 내려왔는지, 누가 내리치라고 했는지까지. 마크가 내가 없을 때 네 눈이 돼 줄 거라며 안겨 준 개가, 마크의 여자가 시킨 손에 빗속에 쓰러졌다. 오드리는 보이지 않는 사람처럼 허공을 더듬다가, 지팡이 쇠끝으로 티파니의 허벅지를 정확히 찌른다. 「아악! 이 장님 년이 내 다리를 찔렀어!」</w:t>
+        <w:t>그 경보는 웰스 타워 회의실에 있던 닉의 화면에 뜨지만, 폭풍 속에서 몇 번 깜빡이다 끊긴다. 하늘길이 닫힐 수 있다는 비서의 말에도 닉은 당장 전용기를 띄우라고 한다. 그 시각 공항 하차장, 빗속에 베어를 안고 주저앉은 오드리 앞에 검은 SUV가 선다. 티파니가 운전기사를 데리고 쫓아 나온 것이다. 기사가 오드리의 팔을 잡아 차에 태우려 하자, 피투성이 베어가 다시 일어나 기사 앞을 막아선다. 티파니가 저 개를 치우라고 하고, 기사는 트렁크에서 꺼낸 타이어 렌치로 베어를 내리친다. 티파니는 오드리의 머리채를 잡아 그 앞으로 얼굴을 들이민다. 빗물 위에 쓰러진 베어가 더는 움직이지 않는다. 「방금 거 진짜 볼만했는데. 장님이라 아깝다.」 오드리는 다 봤다. 렌치가 몇 번 내려왔는지, 누가 내리치라고 했는지까지. 마크가 내가 없을 때 네 눈이 돼 줄 거라며 안겨 준 개가, 마크의 여자가 시킨 기사의 렌치에 빗속에 쓰러졌다. 오드리는 보이지 않는 사람처럼 허공을 더듬다가, 지팡이 쇠끝으로 티파니의 허벅지를 정확히 찌른다. 「아악! 이 장님 년이 내 다리를 찔렀어!」</w:t>
       </w:r>
     </w:p>
     <w:p>
@@ -6824,7 +6824,7 @@
           <w:b w:val="0"/>
           <w:sz w:val="21"/>
         </w:rPr>
-        <w:t>티파니의 비명에 터미널 사람들이 몰려나오고, 누군가 이거 지금 생방송으로 나가고 있다고 외친다. 내일 상장 전에 이 일이 퍼지면 마크가 가만있지 않을 걸 아는 티파니는, 경호원들에게 오드리의 입을 막아 전용기 계류장으로 끌고 가라고 한다. 앞 못 보는 여자가 길을 잃고 빠져 죽은 사고로 만들라는 것이다. 막아서던 여자 승객은 경호원에게 밀려 넘어진다. 경호원들은 재갈을 물린 오드리를 계류장 끝, 폭우로 불어난 배수로 앞에 무릎 꿇린다. 기사가 차마 밀지 못하고 머뭇거리자, 티파니는 기사 뺨을 때리고 다리를 절며 다가와 직접 오드리의 등을 떠민다. 오드리는 떨어지면서도 두 팔로 머리부터 감싸고, 콘크리트 벽에는 팔꿈치가 먼저 부딪힌다. 붕대를 푼 지 아홉 시간, 일주일 가운데 첫날도 아직 다 가지 않았다. 오드리가 물살 속에서 배수로 가장자리를 붙잡자, 티파니는 그 손가락을 하이힐로 짓밟는다. 「장님 주제에 왜 이렇게 질겨? 손 놔.」 그 순간 계류장 저편에서 남자 목소리가 울린다. 「다들 멈춰! 터미널 창문마다 카메라야!」</w:t>
+        <w:t>티파니의 비명에 터미널 사람들이 몰려나오고, 누군가 이거 지금 생방송으로 나가고 있다고 외친다. 내일 상장 전에 이 일이 퍼지면 마크가 가만있지 않을 걸 아는 티파니는, 경호원들에게 오드리의 입을 막아 전용기 계류장으로 끌고 가라고 한다. 앞 못 보는 여자가 길을 잃고 빠져 죽은 사고로 만들라는 것이다. 막아서던 여자 승객은 경호원에게 밀려 넘어진다. 경호원들은 재갈을 물린 오드리를 계류장 끝, 폭우로 불어난 배수로 앞에 무릎 꿇린다. 기사가 차마 밀지 못하고 머뭇거리자, 티파니는 기사 뺨을 때리고 다리를 절며 다가와 직접 오드리의 등을 떠민다. 오드리는 떨어지면서도 두 팔로 머리부터 감싸고, 콘크리트 벽에는 팔꿈치가 먼저 부딪힌다. 붕대를 푼 지 아홉 시간, 머리를 한 번만 다쳐도 다시 먼다는 일주일 가운데 첫날도 아직 다 가지 않았다. 오드리가 물살 속에서 배수로 가장자리를 붙잡자, 티파니는 그 손가락을 하이힐로 짓밟는다. 「장님 주제에 왜 이렇게 질겨? 손 놔.」 그 순간 계류장 저편에서 남자 목소리가 울린다. 「다들 멈춰! 터미널 창문마다 카메라야!」</w:t>
       </w:r>
     </w:p>
     <w:p>
@@ -6904,7 +6904,7 @@
           <w:b w:val="0"/>
           <w:sz w:val="21"/>
         </w:rPr>
-        <w:t>복도에 웃음이 터지는데, 오드리 반지 안쪽의 '마크가 오드리에게'를 읽은 응급실 의사만 웃지 않고 포스터 그룹에 전화를 건다. 딘의 대답을 들은 의사는 아무도 그 여자 몸에 손대지 말라고 소리친다. 대표가 세상에 숨겨 온 진짜 포스터 부인이라는 것이다. 내연녀가 애까지 데리고 와서 본처를 때렸다는 수군거림이 복도를 채운다. 그 사이 복도 끝 엘리베이터가 열리고 마크가 걸어 나온다. 오드리가 태어나 처음 맨눈으로 보는 남편이다. 마크는 티파니를 지나쳐 오드리 앞에 무릎을 꿇고, 앞 못 보는 아내에게 늘 그랬듯 손을 잡으며 나라고, 이제 괜찮다고 말한다. 그러면서 등 뒤로, 티파니에게 아이를 데리고 나가라고 손짓한다. 카메라는 마크의 얼굴이 아니라, 그 손짓을 똑바로 보고 있는 오드리의 눈을 잡는다.</w:t>
+        <w:t>복도에 웃음이 터지는데, 오드리 반지 안쪽의 '마크가 오드리에게'를 읽은 응급실 의사만 웃지 않고 포스터 그룹에 전화를 건다. 딘의 대답을 들은 의사는 아무도 그 여자 몸에 손대지 말라고 소리친다. 대표가 세상에 숨겨 온 진짜 포스터 부인이라는 것이다. 내연녀가 애까지 데리고 와서 본처를 때렸다는 수군거림이 복도를 채운다. 그 사이 복도 끝 엘리베이터가 열리고 마크가 걸어 나온다. 오드리가 태어나 처음 맨눈으로 보는 남편이다. 마크는 티파니를 지나쳐 오드리 앞에 무릎을 꿇고, 앞 못 보는 아내에게 늘 그랬듯 손을 잡으며 남편이 왔으니 이제 괜찮다고 말한다. 그러면서 등 뒤로, 티파니에게 아이를 데리고 나가라고 손짓한다. 카메라는 마크의 얼굴이 아니라, 그 손짓을 똑바로 보고 있는 오드리의 눈을 잡는다.</w:t>
       </w:r>
     </w:p>
     <w:p>
@@ -7580,7 +7580,7 @@
           <w:b w:val="0"/>
           <w:sz w:val="21"/>
         </w:rPr>
-        <w:t>3. 정부가 짓밟는 그 여자가 남편 출세의 옥새 주인이라는 아이러니</w:t>
+        <w:t>3. 정부가 짓밟는 그 여자가 남편 출세에 꼭 필요한 왕실 도장의 주인이라는 아이러니</w:t>
       </w:r>
     </w:p>
     <w:p>
@@ -7647,7 +7647,7 @@
           <w:b w:val="0"/>
           <w:sz w:val="21"/>
         </w:rPr>
-        <w:t>그 사이먼은 아들까지 낳아 준 정부 레이디 모니카에게, 내일 섭정공 임명장에 공주의 옥새만 찍히면 숨겨 둔 아내를 버리겠다고 약속해 두었다. 그날 항구의 귀빈 여관에 모니카와 여섯 살 토비가 들어선다. 토비는 늑대를 쓰다듬던 여자아이를 밀쳐 내고, 촛불을 늑대 눈앞에 들이대더니 화로에서 달군 쇠꼬챙이를 늑대 등에 누른다. 늑대가 몸을 비틀자 넘어진 토비가 물렸다고 울고, 모니카가 경비들을 부른다. 「감히 내 아들을 물어? 이 짐승, 여기서 때려죽여.」</w:t>
+        <w:t>그 사이먼은 아들까지 낳아 준 정부 레이디 모니카에게, 내일 왕 대신 나라를 다스리는 섭정공 임명장에 공주의 왕실 도장만 찍히면 숨겨 둔 아내를 버리겠다고 약속해 두었다. 그날 항구의 귀빈 여관에 모니카와 여섯 살 토비가 들어선다. 토비는 늑대를 쓰다듬던 여자아이를 밀쳐 내고, 촛불을 늑대 눈앞에 들이대더니 화로에서 달군 쇠꼬챙이를 늑대 등에 누른다. 늑대가 몸을 비틀자 넘어진 토비가 물렸다고 울고, 모니카가 경비들을 부른다. 「감히 내 아들을 물어? 이 짐승, 여기서 때려죽여.」</w:t>
       </w:r>
     </w:p>
     <w:p>
@@ -7701,7 +7701,7 @@
           <w:b w:val="0"/>
           <w:sz w:val="21"/>
         </w:rPr>
-        <w:t>모니카는 남편 이름만 듣고 겁먹었냐며, 사이먼은 장님만 보면 속이 뒤집힌다고 했다고 아멜리아의 귀에 대고 웃는다. 토비도 거든다. 아빠가 장님은 숟가락도 못 찾는다고 했다며, 그 짐승이랑 마구간에서 여물이나 먹으라고 침을 뱉는다. 아빠라는 말에 아멜리아는 숨이 멎는다. 아이를 못 가져 미안하다고 울던 밤, 사이먼은 대 이을 아이 따위 필요 없다며 아멜리아의 손등에 입을 맞췄다. 그 사이먼에게 여섯 살 아들이 있다. 아멜리아는 몰래 지팡이 끝 은피리를 더듬는다. 무슨 일이 생기면 불라고, 그러면 매가 듣고 오빠에게 날아간다며 윌리엄이 달아 준 피리다. 모니카가 그 손을 걷어차고 쇠 촛대를 집어 들자, 등을 덴 늑대가 모니카의 치맛자락을 물고 늘어진다. 모니카가 촛대를 머리 위로 치켜든다. 「이 짐승부터 때려죽인다!」</w:t>
+        <w:t>모니카는 남편 이름만 듣고 겁먹었냐며, 사이먼은 장님만 보면 속이 뒤집힌다고 했다고 아멜리아의 귀에 대고 웃는다. 토비도 거든다. 아빠가 장님은 숟가락도 못 찾는다고 했다며, 그 짐승이랑 마구간에서 여물이나 먹으라고 침을 뱉는다. 아빠라는 말에 아멜리아는 숨이 멎는다. 아멜리아가 아이를 못 가져 미안하다고 울던 밤, 사이먼은 대 이을 아이 따위 필요 없다며 아멜리아의 손등에 입을 맞췄다. 그 사이먼에게 여섯 살 아들이 있다. 아멜리아는 몰래 지팡이 끝 은피리를 더듬는다. 무슨 일이 생기면 불라고, 그러면 매가 듣고 오빠에게 날아간다며 윌리엄이 달아 준 피리다. 모니카가 그 손을 걷어차고 쇠 촛대를 집어 들자, 등을 덴 늑대가 모니카의 치맛자락을 물고 늘어진다. 모니카가 촛대를 머리 위로 치켜든다. 「이 짐승부터 때려죽인다!」</w:t>
       </w:r>
     </w:p>
     <w:p>
@@ -7728,7 +7728,7 @@
           <w:b w:val="0"/>
           <w:sz w:val="21"/>
         </w:rPr>
-        <w:t>촛대가 몇 번이고 내리꽂히고, 늑대는 피를 쏟으며 바닥에 늘어진다. 아멜리아는 두 손으로 늑대의 상처를 누르며 짐승 의원에게 데려가게 해 달라고 빌지만, 손님들은 저 여자 남편이 사이먼 공작이라며 고개를 돌린다. 모니카는 이 짐승은 내 아들을 문 값으로 여기서 죽고, 너는 숨 끊어지는 소리나 들으라고 한다. 토비는 손뼉을 치며 저 가죽을 벗겨 제 방 깔개로 삼겠다고 조른다. 모니카는 경비에게 아멜리아의 턱 밑에 칼끝을 대게 하고 자랑을 늘어놓는다. 내일 아침 공주가 옥새를 찍으면 남편은 섭정공이 되고, 이 나라가 남편 손에 들어온다는 것이다. 모니카는 사이먼이 숨겨 둔 아내가 공주라는 걸 모른다. 칼끝에 턱이 들린 채 아멜리아가 입을 연다. 「섭정공 임명장? 그건 공주의 옥새가 있어야 해. 내 옥새. 윌리엄 왕이 내 오빠야.」 모니카의 웃음이 멎는다. 「네가…… 공주라고?」</w:t>
+        <w:t>촛대가 몇 번이고 내리꽂히고, 늑대는 피를 쏟으며 바닥에 늘어진다. 아멜리아는 두 손으로 늑대의 상처를 누르며 짐승 의원에게 데려가게 해 달라고 빌지만, 손님들은 저 여자 남편이 사이먼 공작이라며 고개를 돌린다. 모니카는 이 짐승은 내 아들을 문 값으로 여기서 죽고, 너는 숨 끊어지는 소리나 들으라고 한다. 토비는 손뼉을 치며 저 가죽을 벗겨 제 방 깔개로 삼겠다고 조른다. 모니카는 경비에게 아멜리아의 턱 밑에 칼끝을 대게 하고 자랑을 늘어놓는다. 내일 아침 왕궁의 공주가 왕실 도장을 찍으면 남편은 섭정공이 되고, 이 나라가 남편 손에 들어온다는 것이다. 모니카는 사이먼이 숨겨 둔 아내가 공주라는 걸 모른다. 칼끝에 턱이 들린 채 아멜리아가 입을 연다. 「섭정공 임명장? 그건 공주의 왕실 도장이 있어야 해. 그 도장, 내 거야. 윌리엄 왕이 내 오빠야.」 모니카의 웃음이 멎는다. 「네가…… 공주라고?」</w:t>
       </w:r>
     </w:p>
     <w:p>
@@ -7755,7 +7755,7 @@
           <w:b w:val="0"/>
           <w:sz w:val="21"/>
         </w:rPr>
-        <w:t>모니카는 배를 잡고 웃는다. 진짜 공주는 호위 기사 백 명을 끌고 다니지, 이렇게 남의 발밑을 기어다니지 않는다는 것이다. 오늘 아침 아멜리아가 제 손으로 물린 바로 그 호위 기사들이다. 모니카는 하인을 보내 사이먼에게 전하게 한다. 웬 미친 여자의 짐승이 토비를 물었는데, 그 여자가 자기가 공주라고 떠든다고. 공주는 지금 왕궁에 있다고 믿는 사이먼은 성으로 가던 마차를 항구로 돌리라고 소리친다. 그 사이 토비가 늑대의 가죽 목줄을 풀어 엄마 손에 쥐여 주고, 모니카는 그 목줄로 늑대의 목을 조른다. 그 순간 부엌 하녀가 화로의 재를 한 삽 퍼서 모니카 얼굴에 끼얹고, 아멜리아의 손을 잡아 장작 창고 쪽문으로 이끈다. 아멜리아는 늘어진 늑대를 품에 안고 빗속 부두로 기어 나가 하늘에 대고 울부짖는다. 「오빠! 내 늑대가 죽어 가! 제발 와 줘!」</w:t>
+        <w:t>모니카는 배를 잡고 웃는다. 진짜 공주는 호위 기사 백 명을 끌고 다니지, 이렇게 남의 발밑을 기어다니지 않는다는 것이다. 오늘 아침 아멜리아가 제 손으로 돌려보낸 바로 그 호위 기사들이다. 모니카는 하인을 보내 사이먼에게 전하게 한다. 웬 미친 여자의 짐승이 토비를 물었는데, 그 여자가 자기가 공주라고 떠든다고. 공주는 지금 왕궁에 있다고 믿는 사이먼은 성으로 가던 마차를 항구로 돌리라고 소리친다. 그 사이 토비가 늑대의 가죽 목줄을 풀어 엄마 손에 쥐여 주고, 모니카는 그 목줄로 늑대의 목을 조른다. 그 순간 부엌 하녀가 화로의 재를 한 삽 퍼서 모니카 얼굴에 끼얹고, 아멜리아의 손을 잡아 장작 창고 쪽문으로 이끈다. 아멜리아는 늘어진 늑대를 품에 안고 빗속 부두로 기어 나가 하늘에 대고 울부짖는다. 「오빠! 내 늑대가 죽어 가! 제발 와 줘!」</w:t>
       </w:r>
     </w:p>
     <w:p>
@@ -7782,7 +7782,7 @@
           <w:b w:val="0"/>
           <w:sz w:val="21"/>
         </w:rPr>
-        <w:t>그 소리가 닿지 않는 바다 위 군함에서, 윌리엄 왕은 폭풍 속에서 동생의 배를 놓쳤다는 보고를 받는다. 윌리엄은 바다가 뒤집혀도 상관없다며 군함을 항구로 돌리라고 명령한다. 부두에서 아멜리아가 은피리를 부는 사이, 얼굴에 재를 뒤집어쓴 모니카가 탄 마차가 빗속을 가르며 아멜리아에게 달려든다. 자정이 멀어 사람으로 돌아올 수 없는 로건은 늑대의 몸 그대로 아멜리아 품에서 튀어 나가 말 앞을 막아서고, 바퀴가 그 위를 넘어간다. 마차에서 내린 모니카는 아멜리아의 머리채를 잡아 올리며, 앞을 못 보니 네 짐승 꼴을 구경도 못 하겠다고 웃는다. 아멜리아의 귀에 3년 전 사이먼의 목소리가 되살아난다. 내가 없을 때 이 아이가 네 눈이 될 거야. 아멜리아는 그 약속이 전부 거짓말이었다고 중얼거리고, 머리에서 은비녀를 뽑아 모니카의 허벅지에 꽂는다. 「이 장님 년이 감히 내 다리를! 너 오늘 산 채로 못 나가!」</w:t>
+        <w:t>그 소리가 닿지 않는 바다 위 군함에서, 윌리엄 왕은 폭풍 속에서 동생의 배를 놓쳤다는 보고를 받는다. 윌리엄은 바다가 뒤집혀도 상관없다며 군함을 항구로 돌리라고 명령한다. 부두에서 아멜리아가 은피리를 부는 사이, 얼굴에 재를 뒤집어쓴 모니카가 탄 마차가 빗속을 가르며 아멜리아에게 달려든다. 자정이 멀어 사람으로 돌아올 수 없는 로건은 늑대의 몸 그대로 아멜리아 품에서 튀어 나가 말 앞을 막아서고, 바퀴가 그 위를 넘어간다. 마차에서 내린 모니카는 아멜리아의 머리채를 잡아 올리며, 앞을 못 보니 네 짐승 꼴을 구경도 못 하겠다고 웃는다. 아멜리아의 귀에 3년 전 사이먼의 목소리가 되살아난다. 내가 없을 때 이 늑대가 네 눈이 될 거야. 아멜리아는 그 약속이 전부 거짓말이었다고 중얼거리고, 머리에서 은비녀를 뽑아 모니카의 허벅지에 꽂는다. 「이 장님 년이 감히 내 다리를! 너 오늘 산 채로 못 나가!」</w:t>
       </w:r>
     </w:p>
     <w:p>
@@ -7809,7 +7809,7 @@
           <w:b w:val="0"/>
           <w:sz w:val="21"/>
         </w:rPr>
-        <w:t>모니카의 비명에 부두 사람들이 몰려들고, 앞 못 보는 여자를 마차로 죽이려 했다는 말이 항구 전체로 번진다. 내일 임명식 전에 소문이 나면 끝이라는 걸 아는 모니카는, 아멜리아의 입을 막아 짐마차 뒤에 묶고 선창 끝까지 끌고 가 사고로 보이게 하라고 경비들에게 명령한다. 바퀴에 깔린 늑대는 토비가 가죽을 갖겠다며 우리에 넣어 마차에 싣는다. 재갈을 문 아멜리아가 밧줄에 묶인 채 돌바닥 위로 끌려가고, 마부가 더 가면 파도에 휩쓸린다며 고삐를 당기자 모니카가 고삐를 빼앗아 직접 말을 몬다. 그 시각 항구 문 앞에 닿은 사이먼은 모니카와 토비가 곤란하다는 말에 수석 집사를 먼저 달려 보낸다. 밧줄을 붙든 손바닥이 찢어지는 동안, 아멜리아는 무서워하지 마, 오빠가 있다던 윌리엄의 목소리만 붙든다. 선창 끝 파도가 코앞에 닥친 순간, 누군가 마차 앞을 막아선다. 「당장 마차 세워! 공작님 명이다!」</w:t>
+        <w:t>모니카의 비명에 부두 사람들이 몰려들고, 앞 못 보는 여자를 마차로 죽이려 했다는 말이 항구 전체로 번진다. 내일 임명식 전에 소문이 나면 끝이라는 걸 아는 모니카는, 아멜리아의 입을 막아 짐마차 뒤에 묶고 선창 끝까지 끌고 가 사고로 보이게 하라고 경비들에게 명령한다. 바퀴에 깔린 늑대는 토비가 가죽을 갖겠다며 우리에 넣어 마차에 싣는다. 재갈을 문 아멜리아가 밧줄에 묶인 채 돌바닥 위로 끌려가고, 마부가 더 가면 파도에 휩쓸린다며 고삐를 당기자 모니카가 고삐를 빼앗아 직접 말을 몬다. 그 시각 항구 문 앞에 닿은 사이먼은 모니카와 토비가 곤란하다는 말에 수석 집사를 먼저 달려 보낸다. 밧줄을 붙든 손바닥이 찢어지는 동안, 아멜리아는 무서워하지 말라고, 오빠가 있다고 하던 윌리엄의 목소리만 떠올리며 버틴다. 선창 끝 파도가 코앞에 닥친 순간, 누군가 마차 앞을 막아선다. 「당장 마차 세워! 공작님 명이다!」</w:t>
       </w:r>
     </w:p>
     <w:p>
@@ -7836,7 +7836,7 @@
           <w:b w:val="0"/>
           <w:sz w:val="21"/>
         </w:rPr>
-        <w:t>마차를 세운 사람은 사이먼의 수석 집사다. 다리에서 피를 흘리는 모니카가 저 여자를 당장 죽이라고 악을 쓰자, 집사는 부두 사람 절반이 보고 있으니 소문이 나면 내일 임명식이 날아간다고 막는다. 진흙과 피에 덮인 아멜리아의 얼굴을 집사는 알아보지 못한다. 집사는 아멜리아를 구빈원에 넣어 아무도 못 만나게 하고, 사이먼이 섭정공에 오른 뒤에 처리하라고 한다. 두 무릎이 부러진 채 끌려가는 아멜리아는 내 늑대를 돌려 달라고 소리치지만, 늑대가 든 우리는 모니카의 마차에 그대로 실려 있다. 같은 시각 항구에 닿은 윌리엄은 벼락에 매가 길을 잃었다는 말에, 자정 전까지 항구를 집집마다 뒤지라고 명령한다. 구빈원에서는 한 치유사가 아멜리아의 무릎에 약초를 붙이지만, 원장은 돈 한 푼 없는 거지는 못 받는다고 한다. 그때 토비와 늑대 우리를 끌고 들어온 모니카가 원장 앞에 금화 주머니를 던지며, 이 여자의 붕대를 풀고 약을 거두라고 한다. 막아서던 치유사가 경비에게 맞아 쓰러지자 모니카는 우리 문을 두드린다. 「오늘 밤, 저 장님이 듣는 앞에서 이 짐승 가죽부터 벗긴다.」</w:t>
+        <w:t>마차를 세운 사람은 사이먼의 수석 집사다. 다리에서 피를 흘리는 모니카가 저 여자를 당장 죽이라고 악을 쓰자, 집사는 부두 사람 절반이 보고 있으니 소문이 나면 내일 임명식이 날아간다고 막는다. 진흙과 피에 덮인 아멜리아의 얼굴을 집사는 알아보지 못한다. 집사는 아멜리아를 구빈원에 넣어 아무도 못 만나게 하고, 사이먼이 섭정공에 오른 뒤에 처리하라고 한다. 두 무릎이 부러진 채 끌려가는 아멜리아는 내 늑대를 돌려 달라고 소리치지만, 늑대가 든 우리는 모니카의 마차에 그대로 실려 있다. 같은 시각 항구에 닿은 윌리엄은 벼락에 매가 길을 잃었다는 말에, 자정 전까지 항구를 집집마다 뒤지라고 명령한다. 구빈원에서는 한 치유사가 아멜리아의 무릎에 약초를 붙이지만, 원장은 돈 한 푼 없는 거지는 못 받는다고 한다. 그때 토비와 늑대 우리를 끌고 들어온 모니카가 원장 앞에 금화 주머니를 던지며, 이 여자 무릎의 붕대를 풀고 붙인 약초를 떼어 내라고 한다. 막아서던 치유사가 경비에게 맞아 쓰러지자 모니카는 우리 문을 두드린다. 「오늘 밤, 저 장님이 듣는 앞에서 이 짐승 가죽부터 벗긴다.」</w:t>
       </w:r>
     </w:p>
     <w:p>
@@ -7966,7 +7966,7 @@
           <w:b w:val="0"/>
           <w:sz w:val="21"/>
         </w:rPr>
-        <w:t>· 원작 내일 상장·50억 계약 ㅡ&gt; 우리 내일 아침 사이먼의 섭정공 임명, 공주의 옥새가 있어야만 되는 자리 (아멜리아가 남편 출세의 열쇠라는 걸 한 물건으로 보이게)</w:t>
+        <w:t>· 원작 내일 상장·50억 계약 ㅡ&gt; 우리 내일 아침 사이먼의 섭정공 임명, 공주의 왕실 도장이 있어야만 되는 자리 (아멜리아가 남편 출세의 열쇠라는 걸 한 물건으로 보이게)</w:t>
       </w:r>
     </w:p>
     <w:p>
@@ -8190,7 +8190,7 @@
           <w:b w:val="0"/>
           <w:sz w:val="21"/>
         </w:rPr>
-        <w:t>· 4화 「내 옥새. 윌리엄 왕이 내 오빠야」와 5화 호위 기사 백 명 비웃음이 이어져, 다 말했는데도 안 믿기는 답답함이 매 화 쌓이고, 바다 위에서 군함을 돌리는 윌리엄 왕이 언제 닿을지가 다음 화를 누르게 한다.</w:t>
+        <w:t>· 4화 「그 도장, 내 거야. 윌리엄 왕이 내 오빠야.」와 5화 호위 기사 백 명 비웃음이 이어져, 다 말했는데도 안 믿기는 답답함이 매 화 쌓이고, 바다 위에서 군함을 돌리는 윌리엄 왕이 언제 닿을지가 다음 화를 누르게 한다.</w:t>
       </w:r>
     </w:p>
     <w:p>

</xml_diff>